<commit_message>
Put all preparation before the summit and allocate rooms upfront
The briefing film, kit, challenge cards, pre-work messages and slide note
now say that each participant's room and case file are allocated in the
invitation, that pre-work is finished before 5 November, and that nothing
is prepared on the day. The kit timeline gains the allocation and
pre-work-done dates.

Co-Authored-By: Claude Opus 5.5 <noreply@anthropic.com>
Claude-Session: https://claude.ai/code/session_01Q2YJhmzjoSxdfw8ZKRnAPH
</commit_message>
<xml_diff>
--- a/ws2/files/WS2_Prework_Messages.docx
+++ b/ws2/files/WS2_Prework_Messages.docx
@@ -58,7 +58,7 @@
         <w:t xml:space="preserve">Send: </w:t>
       </w:r>
       <w:r>
-        <w:t xml:space="preserve">Thu 29 Oct, one week before the summit, from the regional lead or WS2</w:t>
+        <w:t xml:space="preserve">Thu 29 Oct, one week before the summit, once rooms are allocated (Mon 26 Oct), from the regional lead or WS2</w:t>
       </w:r>
     </w:p>
     <w:p>
@@ -98,7 +98,7 @@
     </w:p>
     <w:p>
       <w:r>
-        <w:t xml:space="preserve">Please spend about 20 minutes before the summit:</w:t>
+        <w:t xml:space="preserve">Your room and case file are allocated in advance, so there is nothing to prepare on 5 November. Please spend about 20 minutes on these steps before the summit, by Tuesday 3 November:</w:t>
       </w:r>
     </w:p>
     <w:p>

</xml_diff>

<commit_message>
Drop pre-work time estimates from the briefing film, kit and messages
The film, kit, Word documents and captions no longer give minutes for the
pre-work and say instead that it is essential, since everything in the
room builds on it. Step two of the film now reads: your invitation names
its case file, from C1 to C6.

Co-Authored-By: Claude Opus 5.5 <noreply@anthropic.com>
Claude-Session: https://claude.ai/code/session_01Q2YJhmzjoSxdfw8ZKRnAPH
</commit_message>
<xml_diff>
--- a/ws2/files/WS2_Prework_Messages.docx
+++ b/ws2/files/WS2_Prework_Messages.docx
@@ -73,7 +73,7 @@
         <w:t xml:space="preserve">Subject: </w:t>
       </w:r>
       <w:r>
-        <w:t xml:space="preserve">PM Summit 5 Nov: a 20-minute story before the AI breakout</w:t>
+        <w:t xml:space="preserve">PM Summit 5 Nov: your room and pre-work for the AI breakout</w:t>
       </w:r>
     </w:p>
     <w:p>
@@ -98,7 +98,7 @@
     </w:p>
     <w:p>
       <w:r>
-        <w:t xml:space="preserve">Your room and case file are allocated in advance, so there is nothing to prepare on 5 November. Please spend about 20 minutes on these steps before the summit, by Tuesday 3 November:</w:t>
+        <w:t xml:space="preserve">Your room and case file are allocated in advance, so there is nothing to prepare on 5 November. The pre-work below is essential, because everything your room does on the day builds on it. Please complete it before the summit, by Tuesday 3 November:</w:t>
       </w:r>
     </w:p>
     <w:p>
@@ -111,7 +111,7 @@
         <w:spacing w:after="60"/>
       </w:pPr>
       <w:r>
-        <w:t xml:space="preserve">Read “Fourteen Days”, the attached story (about 12 minutes). It follows the new project manager of KESTREL, a chip project fourteen days from tape-out, through one very ordinary, very bad week.</w:t>
+        <w:t xml:space="preserve">Read “Fourteen Days”, the attached story. It follows the new project manager of KESTREL, a chip project fourteen days from tape-out, through one very ordinary, very bad week.</w:t>
       </w:r>
     </w:p>
     <w:p>

</xml_diff>